<commit_message>
feat: update event status to official and integrate speaker proposal submission flow
</commit_message>
<xml_diff>
--- a/Satellite Symposium Proposal.docx
+++ b/Satellite Symposium Proposal.docx
@@ -6,8 +6,15 @@
       <w:pPr>
         <w:pStyle w:val="NormalWeb"/>
         <w:spacing w:before="240" w:beforeAutospacing="0" w:after="240" w:afterAutospacing="0"/>
-      </w:pPr>
-      <w:proofErr w:type="spellStart"/>
+        <w:rPr>
+          <w:rFonts w:ascii="Arial" w:hAnsi="Arial" w:cs="Arial"/>
+          <w:b/>
+          <w:bCs/>
+          <w:color w:val="000000"/>
+          <w:sz w:val="52"/>
+          <w:szCs w:val="52"/>
+        </w:rPr>
+      </w:pPr>
       <w:r>
         <w:rPr>
           <w:rFonts w:ascii="Arial" w:hAnsi="Arial" w:cs="Arial"/>
@@ -15,9 +22,8 @@
           <w:sz w:val="52"/>
           <w:szCs w:val="52"/>
         </w:rPr>
-        <w:t>NetSci</w:t>
+        <w:t>CCS</w:t>
       </w:r>
-      <w:proofErr w:type="spellEnd"/>
       <w:r>
         <w:rPr>
           <w:rFonts w:ascii="Arial" w:hAnsi="Arial" w:cs="Arial"/>
@@ -45,14 +51,37 @@
           <w:sz w:val="52"/>
           <w:szCs w:val="52"/>
         </w:rPr>
-        <w:t>Edge Cases: Surprising Applications in Network Science</w:t>
+        <w:t xml:space="preserve">Edge Cases: </w:t>
       </w:r>
-    </w:p>
-    <w:p>
-      <w:pPr>
-        <w:pStyle w:val="NormalWeb"/>
-        <w:spacing w:before="240" w:beforeAutospacing="0" w:after="240" w:afterAutospacing="0"/>
-      </w:pPr>
+      <w:r>
+        <w:rPr>
+          <w:rFonts w:ascii="Arial" w:hAnsi="Arial" w:cs="Arial"/>
+          <w:b/>
+          <w:bCs/>
+          <w:color w:val="000000"/>
+          <w:sz w:val="52"/>
+          <w:szCs w:val="52"/>
+        </w:rPr>
+        <w:t>Surprising Applications in Network Science</w:t>
+      </w:r>
+      <w:r>
+        <w:rPr>
+          <w:rFonts w:ascii="Arial" w:hAnsi="Arial" w:cs="Arial"/>
+          <w:b/>
+          <w:bCs/>
+          <w:color w:val="000000"/>
+          <w:sz w:val="52"/>
+          <w:szCs w:val="52"/>
+        </w:rPr>
+        <w:br/>
+      </w:r>
+      <w:r>
+        <w:rPr>
+          <w:rFonts w:ascii="Arial" w:hAnsi="Arial" w:cs="Arial"/>
+          <w:color w:val="000000"/>
+        </w:rPr>
+        <w:br/>
+      </w:r>
       <w:r>
         <w:rPr>
           <w:rFonts w:ascii="Arial" w:hAnsi="Arial" w:cs="Arial"/>
@@ -76,77 +105,6 @@
         <w:pStyle w:val="Heading1"/>
         <w:spacing w:before="400" w:after="120"/>
       </w:pPr>
-      <w:r>
-        <w:rPr>
-          <w:rFonts w:ascii="Arial" w:hAnsi="Arial" w:cs="Arial"/>
-          <w:b/>
-          <w:bCs/>
-          <w:noProof/>
-          <w:color w:val="000000"/>
-          <w:sz w:val="24"/>
-          <w:szCs w:val="24"/>
-          <w:bdr w:val="none" w:sz="0" w:space="0" w:color="auto" w:frame="1"/>
-        </w:rPr>
-        <w:drawing>
-          <wp:inline distT="0" distB="0" distL="0" distR="0" wp14:anchorId="1FA62EB6" wp14:editId="7FBE6E66">
-            <wp:extent cx="191135" cy="198120"/>
-            <wp:effectExtent l="0" t="0" r="0" b="5080"/>
-            <wp:docPr id="1193264178" name="Picture 5" descr="A red star shaped logo&#10;&#10;AI-generated content may be incorrect."/>
-            <wp:cNvGraphicFramePr>
-              <a:graphicFrameLocks xmlns:a="http://schemas.openxmlformats.org/drawingml/2006/main" noChangeAspect="1"/>
-            </wp:cNvGraphicFramePr>
-            <a:graphic xmlns:a="http://schemas.openxmlformats.org/drawingml/2006/main">
-              <a:graphicData uri="http://schemas.openxmlformats.org/drawingml/2006/picture">
-                <pic:pic xmlns:pic="http://schemas.openxmlformats.org/drawingml/2006/picture">
-                  <pic:nvPicPr>
-                    <pic:cNvPr id="1193264178" name="Picture 5" descr="A red star shaped logo&#10;&#10;AI-generated content may be incorrect."/>
-                    <pic:cNvPicPr>
-                      <a:picLocks noChangeAspect="1" noChangeArrowheads="1"/>
-                    </pic:cNvPicPr>
-                  </pic:nvPicPr>
-                  <pic:blipFill>
-                    <a:blip r:embed="rId6" cstate="print">
-                      <a:extLst>
-                        <a:ext uri="{28A0092B-C50C-407E-A947-70E740481C1C}">
-                          <a14:useLocalDpi xmlns:a14="http://schemas.microsoft.com/office/drawing/2010/main" val="0"/>
-                        </a:ext>
-                      </a:extLst>
-                    </a:blip>
-                    <a:srcRect/>
-                    <a:stretch>
-                      <a:fillRect/>
-                    </a:stretch>
-                  </pic:blipFill>
-                  <pic:spPr bwMode="auto">
-                    <a:xfrm>
-                      <a:off x="0" y="0"/>
-                      <a:ext cx="191135" cy="198120"/>
-                    </a:xfrm>
-                    <a:prstGeom prst="rect">
-                      <a:avLst/>
-                    </a:prstGeom>
-                    <a:noFill/>
-                    <a:ln>
-                      <a:noFill/>
-                    </a:ln>
-                  </pic:spPr>
-                </pic:pic>
-              </a:graphicData>
-            </a:graphic>
-          </wp:inline>
-        </w:drawing>
-      </w:r>
-      <w:r>
-        <w:rPr>
-          <w:rFonts w:ascii="Arial" w:hAnsi="Arial" w:cs="Arial"/>
-          <w:b/>
-          <w:bCs/>
-          <w:color w:val="000000"/>
-          <w:sz w:val="24"/>
-          <w:szCs w:val="24"/>
-        </w:rPr>
-        <w:t xml:space="preserve"> </w:t>
-      </w:r>
       <w:r>
         <w:rPr>
           <w:rFonts w:ascii="Arial" w:hAnsi="Arial" w:cs="Arial"/>
@@ -209,77 +167,6 @@
           <w:rFonts w:ascii="Arial" w:hAnsi="Arial" w:cs="Arial"/>
           <w:b/>
           <w:bCs/>
-          <w:noProof/>
-          <w:color w:val="000000"/>
-          <w:sz w:val="24"/>
-          <w:szCs w:val="24"/>
-          <w:bdr w:val="none" w:sz="0" w:space="0" w:color="auto" w:frame="1"/>
-        </w:rPr>
-        <w:drawing>
-          <wp:inline distT="0" distB="0" distL="0" distR="0" wp14:anchorId="455AACBF" wp14:editId="21A6314F">
-            <wp:extent cx="191135" cy="198120"/>
-            <wp:effectExtent l="0" t="0" r="0" b="5080"/>
-            <wp:docPr id="432017776" name="Picture 4" descr="A red star shaped logo&#10;&#10;AI-generated content may be incorrect."/>
-            <wp:cNvGraphicFramePr>
-              <a:graphicFrameLocks xmlns:a="http://schemas.openxmlformats.org/drawingml/2006/main" noChangeAspect="1"/>
-            </wp:cNvGraphicFramePr>
-            <a:graphic xmlns:a="http://schemas.openxmlformats.org/drawingml/2006/main">
-              <a:graphicData uri="http://schemas.openxmlformats.org/drawingml/2006/picture">
-                <pic:pic xmlns:pic="http://schemas.openxmlformats.org/drawingml/2006/picture">
-                  <pic:nvPicPr>
-                    <pic:cNvPr id="432017776" name="Picture 4" descr="A red star shaped logo&#10;&#10;AI-generated content may be incorrect."/>
-                    <pic:cNvPicPr>
-                      <a:picLocks noChangeAspect="1" noChangeArrowheads="1"/>
-                    </pic:cNvPicPr>
-                  </pic:nvPicPr>
-                  <pic:blipFill>
-                    <a:blip r:embed="rId6" cstate="print">
-                      <a:extLst>
-                        <a:ext uri="{28A0092B-C50C-407E-A947-70E740481C1C}">
-                          <a14:useLocalDpi xmlns:a14="http://schemas.microsoft.com/office/drawing/2010/main" val="0"/>
-                        </a:ext>
-                      </a:extLst>
-                    </a:blip>
-                    <a:srcRect/>
-                    <a:stretch>
-                      <a:fillRect/>
-                    </a:stretch>
-                  </pic:blipFill>
-                  <pic:spPr bwMode="auto">
-                    <a:xfrm>
-                      <a:off x="0" y="0"/>
-                      <a:ext cx="191135" cy="198120"/>
-                    </a:xfrm>
-                    <a:prstGeom prst="rect">
-                      <a:avLst/>
-                    </a:prstGeom>
-                    <a:noFill/>
-                    <a:ln>
-                      <a:noFill/>
-                    </a:ln>
-                  </pic:spPr>
-                </pic:pic>
-              </a:graphicData>
-            </a:graphic>
-          </wp:inline>
-        </w:drawing>
-      </w:r>
-      <w:r>
-        <w:rPr>
-          <w:rFonts w:ascii="Arial" w:hAnsi="Arial" w:cs="Arial"/>
-          <w:b/>
-          <w:bCs/>
-          <w:color w:val="000000"/>
-          <w:sz w:val="24"/>
-          <w:szCs w:val="24"/>
-        </w:rPr>
-        <w:t xml:space="preserve"> </w:t>
-      </w:r>
-      <w:r>
-        <w:rPr>
-          <w:rFonts w:ascii="Arial" w:hAnsi="Arial" w:cs="Arial"/>
-          <w:b/>
-          <w:bCs/>
           <w:color w:val="000000"/>
         </w:rPr>
         <w:t>Scope &amp; Topics of Interest</w:t>
@@ -334,80 +221,9 @@
           <w:rFonts w:ascii="Arial" w:hAnsi="Arial" w:cs="Arial"/>
           <w:b/>
           <w:bCs/>
-          <w:noProof/>
           <w:color w:val="000000"/>
-          <w:sz w:val="24"/>
-          <w:szCs w:val="24"/>
-          <w:bdr w:val="none" w:sz="0" w:space="0" w:color="auto" w:frame="1"/>
         </w:rPr>
         <w:lastRenderedPageBreak/>
-        <w:drawing>
-          <wp:inline distT="0" distB="0" distL="0" distR="0" wp14:anchorId="42A1F0CE" wp14:editId="337EC707">
-            <wp:extent cx="191135" cy="198120"/>
-            <wp:effectExtent l="0" t="0" r="0" b="5080"/>
-            <wp:docPr id="1411923733" name="Picture 3" descr="A red star shaped logo&#10;&#10;AI-generated content may be incorrect."/>
-            <wp:cNvGraphicFramePr>
-              <a:graphicFrameLocks xmlns:a="http://schemas.openxmlformats.org/drawingml/2006/main" noChangeAspect="1"/>
-            </wp:cNvGraphicFramePr>
-            <a:graphic xmlns:a="http://schemas.openxmlformats.org/drawingml/2006/main">
-              <a:graphicData uri="http://schemas.openxmlformats.org/drawingml/2006/picture">
-                <pic:pic xmlns:pic="http://schemas.openxmlformats.org/drawingml/2006/picture">
-                  <pic:nvPicPr>
-                    <pic:cNvPr id="1411923733" name="Picture 3" descr="A red star shaped logo&#10;&#10;AI-generated content may be incorrect."/>
-                    <pic:cNvPicPr>
-                      <a:picLocks noChangeAspect="1" noChangeArrowheads="1"/>
-                    </pic:cNvPicPr>
-                  </pic:nvPicPr>
-                  <pic:blipFill>
-                    <a:blip r:embed="rId6" cstate="print">
-                      <a:extLst>
-                        <a:ext uri="{28A0092B-C50C-407E-A947-70E740481C1C}">
-                          <a14:useLocalDpi xmlns:a14="http://schemas.microsoft.com/office/drawing/2010/main" val="0"/>
-                        </a:ext>
-                      </a:extLst>
-                    </a:blip>
-                    <a:srcRect/>
-                    <a:stretch>
-                      <a:fillRect/>
-                    </a:stretch>
-                  </pic:blipFill>
-                  <pic:spPr bwMode="auto">
-                    <a:xfrm>
-                      <a:off x="0" y="0"/>
-                      <a:ext cx="191135" cy="198120"/>
-                    </a:xfrm>
-                    <a:prstGeom prst="rect">
-                      <a:avLst/>
-                    </a:prstGeom>
-                    <a:noFill/>
-                    <a:ln>
-                      <a:noFill/>
-                    </a:ln>
-                  </pic:spPr>
-                </pic:pic>
-              </a:graphicData>
-            </a:graphic>
-          </wp:inline>
-        </w:drawing>
-      </w:r>
-      <w:r>
-        <w:rPr>
-          <w:rFonts w:ascii="Arial" w:hAnsi="Arial" w:cs="Arial"/>
-          <w:b/>
-          <w:bCs/>
-          <w:color w:val="000000"/>
-          <w:sz w:val="24"/>
-          <w:szCs w:val="24"/>
-        </w:rPr>
-        <w:t xml:space="preserve"> </w:t>
-      </w:r>
-      <w:r>
-        <w:rPr>
-          <w:rFonts w:ascii="Arial" w:hAnsi="Arial" w:cs="Arial"/>
-          <w:b/>
-          <w:bCs/>
-          <w:color w:val="000000"/>
-        </w:rPr>
         <w:t>Preferred Format</w:t>
       </w:r>
     </w:p>
@@ -766,77 +582,6 @@
           <w:rFonts w:ascii="Arial" w:hAnsi="Arial" w:cs="Arial"/>
           <w:b/>
           <w:bCs/>
-          <w:noProof/>
-          <w:color w:val="000000"/>
-          <w:sz w:val="24"/>
-          <w:szCs w:val="24"/>
-          <w:bdr w:val="none" w:sz="0" w:space="0" w:color="auto" w:frame="1"/>
-        </w:rPr>
-        <w:drawing>
-          <wp:inline distT="0" distB="0" distL="0" distR="0" wp14:anchorId="599FEB5F" wp14:editId="1BAC13C2">
-            <wp:extent cx="191135" cy="198120"/>
-            <wp:effectExtent l="0" t="0" r="0" b="5080"/>
-            <wp:docPr id="905768856" name="Picture 2" descr="A red star shaped logo&#10;&#10;AI-generated content may be incorrect."/>
-            <wp:cNvGraphicFramePr>
-              <a:graphicFrameLocks xmlns:a="http://schemas.openxmlformats.org/drawingml/2006/main" noChangeAspect="1"/>
-            </wp:cNvGraphicFramePr>
-            <a:graphic xmlns:a="http://schemas.openxmlformats.org/drawingml/2006/main">
-              <a:graphicData uri="http://schemas.openxmlformats.org/drawingml/2006/picture">
-                <pic:pic xmlns:pic="http://schemas.openxmlformats.org/drawingml/2006/picture">
-                  <pic:nvPicPr>
-                    <pic:cNvPr id="905768856" name="Picture 2" descr="A red star shaped logo&#10;&#10;AI-generated content may be incorrect."/>
-                    <pic:cNvPicPr>
-                      <a:picLocks noChangeAspect="1" noChangeArrowheads="1"/>
-                    </pic:cNvPicPr>
-                  </pic:nvPicPr>
-                  <pic:blipFill>
-                    <a:blip r:embed="rId6" cstate="print">
-                      <a:extLst>
-                        <a:ext uri="{28A0092B-C50C-407E-A947-70E740481C1C}">
-                          <a14:useLocalDpi xmlns:a14="http://schemas.microsoft.com/office/drawing/2010/main" val="0"/>
-                        </a:ext>
-                      </a:extLst>
-                    </a:blip>
-                    <a:srcRect/>
-                    <a:stretch>
-                      <a:fillRect/>
-                    </a:stretch>
-                  </pic:blipFill>
-                  <pic:spPr bwMode="auto">
-                    <a:xfrm>
-                      <a:off x="0" y="0"/>
-                      <a:ext cx="191135" cy="198120"/>
-                    </a:xfrm>
-                    <a:prstGeom prst="rect">
-                      <a:avLst/>
-                    </a:prstGeom>
-                    <a:noFill/>
-                    <a:ln>
-                      <a:noFill/>
-                    </a:ln>
-                  </pic:spPr>
-                </pic:pic>
-              </a:graphicData>
-            </a:graphic>
-          </wp:inline>
-        </w:drawing>
-      </w:r>
-      <w:r>
-        <w:rPr>
-          <w:rFonts w:ascii="Arial" w:hAnsi="Arial" w:cs="Arial"/>
-          <w:b/>
-          <w:bCs/>
-          <w:color w:val="000000"/>
-          <w:sz w:val="24"/>
-          <w:szCs w:val="24"/>
-        </w:rPr>
-        <w:t xml:space="preserve"> </w:t>
-      </w:r>
-      <w:r>
-        <w:rPr>
-          <w:rFonts w:ascii="Arial" w:hAnsi="Arial" w:cs="Arial"/>
-          <w:b/>
-          <w:bCs/>
           <w:color w:val="000000"/>
         </w:rPr>
         <w:t>Organizers &amp; Contact</w:t>
@@ -878,7 +623,7 @@
         </w:rPr>
         <w:t xml:space="preserve"> (Wolfram Research/Complexity Coffee): </w:t>
       </w:r>
-      <w:hyperlink r:id="rId7" w:history="1">
+      <w:hyperlink r:id="rId6" w:history="1">
         <w:r>
           <w:rPr>
             <w:rStyle w:val="Hyperlink"/>
@@ -941,7 +686,7 @@
         </w:rPr>
         <w:t xml:space="preserve">(Wolfram): </w:t>
       </w:r>
-      <w:hyperlink r:id="rId8" w:history="1">
+      <w:hyperlink r:id="rId7" w:history="1">
         <w:r>
           <w:rPr>
             <w:rStyle w:val="Hyperlink"/>
@@ -1004,72 +749,17 @@
           <w:rFonts w:ascii="Arial" w:hAnsi="Arial" w:cs="Arial"/>
           <w:b/>
           <w:bCs/>
-          <w:noProof/>
           <w:color w:val="000000"/>
-          <w:sz w:val="24"/>
-          <w:szCs w:val="24"/>
-          <w:bdr w:val="none" w:sz="0" w:space="0" w:color="auto" w:frame="1"/>
         </w:rPr>
-        <w:drawing>
-          <wp:inline distT="0" distB="0" distL="0" distR="0" wp14:anchorId="671581DD" wp14:editId="74C0989F">
-            <wp:extent cx="191135" cy="198120"/>
-            <wp:effectExtent l="0" t="0" r="0" b="5080"/>
-            <wp:docPr id="1851536208" name="Picture 1" descr="A red star shaped logo&#10;&#10;AI-generated content may be incorrect."/>
-            <wp:cNvGraphicFramePr>
-              <a:graphicFrameLocks xmlns:a="http://schemas.openxmlformats.org/drawingml/2006/main" noChangeAspect="1"/>
-            </wp:cNvGraphicFramePr>
-            <a:graphic xmlns:a="http://schemas.openxmlformats.org/drawingml/2006/main">
-              <a:graphicData uri="http://schemas.openxmlformats.org/drawingml/2006/picture">
-                <pic:pic xmlns:pic="http://schemas.openxmlformats.org/drawingml/2006/picture">
-                  <pic:nvPicPr>
-                    <pic:cNvPr id="1851536208" name="Picture 1" descr="A red star shaped logo&#10;&#10;AI-generated content may be incorrect."/>
-                    <pic:cNvPicPr>
-                      <a:picLocks noChangeAspect="1" noChangeArrowheads="1"/>
-                    </pic:cNvPicPr>
-                  </pic:nvPicPr>
-                  <pic:blipFill>
-                    <a:blip r:embed="rId6" cstate="print">
-                      <a:extLst>
-                        <a:ext uri="{28A0092B-C50C-407E-A947-70E740481C1C}">
-                          <a14:useLocalDpi xmlns:a14="http://schemas.microsoft.com/office/drawing/2010/main" val="0"/>
-                        </a:ext>
-                      </a:extLst>
-                    </a:blip>
-                    <a:srcRect/>
-                    <a:stretch>
-                      <a:fillRect/>
-                    </a:stretch>
-                  </pic:blipFill>
-                  <pic:spPr bwMode="auto">
-                    <a:xfrm>
-                      <a:off x="0" y="0"/>
-                      <a:ext cx="191135" cy="198120"/>
-                    </a:xfrm>
-                    <a:prstGeom prst="rect">
-                      <a:avLst/>
-                    </a:prstGeom>
-                    <a:noFill/>
-                    <a:ln>
-                      <a:noFill/>
-                    </a:ln>
-                  </pic:spPr>
-                </pic:pic>
-              </a:graphicData>
-            </a:graphic>
-          </wp:inline>
-        </w:drawing>
+        <w:lastRenderedPageBreak/>
+        <w:t>Preliminary Speakers &amp; Recruitment Strategy</w:t>
       </w:r>
-      <w:r>
-        <w:rPr>
-          <w:rFonts w:ascii="Arial" w:hAnsi="Arial" w:cs="Arial"/>
-          <w:b/>
-          <w:bCs/>
-          <w:color w:val="000000"/>
-          <w:sz w:val="24"/>
-          <w:szCs w:val="24"/>
-        </w:rPr>
-        <w:t xml:space="preserve"> </w:t>
-      </w:r>
+    </w:p>
+    <w:p>
+      <w:pPr>
+        <w:pStyle w:val="Heading2"/>
+        <w:spacing w:before="360" w:after="120"/>
+      </w:pPr>
       <w:r>
         <w:rPr>
           <w:rFonts w:ascii="Arial" w:hAnsi="Arial" w:cs="Arial"/>
@@ -1077,67 +767,6 @@
           <w:bCs/>
           <w:color w:val="000000"/>
         </w:rPr>
-        <w:t>Preliminary Speakers &amp; Recruitment Strategy</w:t>
-      </w:r>
-    </w:p>
-    <w:p>
-      <w:pPr>
-        <w:pStyle w:val="NormalWeb"/>
-        <w:spacing w:before="240" w:beforeAutospacing="0" w:after="240" w:afterAutospacing="0"/>
-      </w:pPr>
-      <w:r>
-        <w:rPr>
-          <w:rFonts w:ascii="Arial" w:hAnsi="Arial" w:cs="Arial"/>
-          <w:color w:val="000000"/>
-        </w:rPr>
-        <w:t xml:space="preserve">This symposium is the inaugural collaboration between </w:t>
-      </w:r>
-      <w:r>
-        <w:rPr>
-          <w:rFonts w:ascii="Arial" w:hAnsi="Arial" w:cs="Arial"/>
-          <w:b/>
-          <w:bCs/>
-          <w:color w:val="000000"/>
-        </w:rPr>
-        <w:t>Wolfram Research</w:t>
-      </w:r>
-      <w:r>
-        <w:rPr>
-          <w:rFonts w:ascii="Arial" w:hAnsi="Arial" w:cs="Arial"/>
-          <w:color w:val="000000"/>
-        </w:rPr>
-        <w:t xml:space="preserve"> and the </w:t>
-      </w:r>
-      <w:r>
-        <w:rPr>
-          <w:rFonts w:ascii="Arial" w:hAnsi="Arial" w:cs="Arial"/>
-          <w:b/>
-          <w:bCs/>
-          <w:color w:val="000000"/>
-        </w:rPr>
-        <w:t>Complexity Coffee</w:t>
-      </w:r>
-      <w:r>
-        <w:rPr>
-          <w:rFonts w:ascii="Arial" w:hAnsi="Arial" w:cs="Arial"/>
-          <w:color w:val="000000"/>
-        </w:rPr>
-        <w:t xml:space="preserve"> alumni network. We are leveraging these two distinct pools of researchers to ensure a diverse and high-caliber lineup.</w:t>
-      </w:r>
-    </w:p>
-    <w:p>
-      <w:pPr>
-        <w:pStyle w:val="Heading2"/>
-        <w:spacing w:before="360" w:after="120"/>
-      </w:pPr>
-      <w:r>
-        <w:rPr>
-          <w:rFonts w:ascii="Arial" w:hAnsi="Arial" w:cs="Arial"/>
-          <w:b/>
-          <w:bCs/>
-          <w:color w:val="000000"/>
-        </w:rPr>
-        <w:lastRenderedPageBreak/>
         <w:t>Confirmed Expressions of Interest (direct outreach):</w:t>
       </w:r>
     </w:p>
@@ -1863,37 +1492,6 @@
           <w:ilvl w:val="0"/>
           <w:numId w:val="101"/>
         </w:numPr>
-        <w:spacing w:before="240" w:beforeAutospacing="0" w:after="0" w:afterAutospacing="0"/>
-        <w:textAlignment w:val="baseline"/>
-        <w:rPr>
-          <w:rFonts w:ascii="Arial" w:hAnsi="Arial" w:cs="Arial"/>
-          <w:color w:val="000000"/>
-        </w:rPr>
-      </w:pPr>
-      <w:r>
-        <w:rPr>
-          <w:rFonts w:ascii="Arial" w:hAnsi="Arial" w:cs="Arial"/>
-          <w:b/>
-          <w:bCs/>
-          <w:color w:val="000000"/>
-        </w:rPr>
-        <w:t>The Santa Fe Institute &amp; CGS Ecosystem:</w:t>
-      </w:r>
-      <w:r>
-        <w:rPr>
-          <w:rFonts w:ascii="Arial" w:hAnsi="Arial" w:cs="Arial"/>
-          <w:color w:val="000000"/>
-        </w:rPr>
-        <w:t xml:space="preserve"> We are actively soliciting speakers from the Complexity Global School (CGS) alumni networks, organizers, and faculty; the Complexity Coffee network.</w:t>
-      </w:r>
-    </w:p>
-    <w:p>
-      <w:pPr>
-        <w:pStyle w:val="NormalWeb"/>
-        <w:numPr>
-          <w:ilvl w:val="0"/>
-          <w:numId w:val="101"/>
-        </w:numPr>
         <w:spacing w:before="0" w:beforeAutospacing="0" w:after="0" w:afterAutospacing="0"/>
         <w:textAlignment w:val="baseline"/>
         <w:rPr>
@@ -1926,6 +1524,68 @@
           <w:numId w:val="101"/>
         </w:numPr>
         <w:spacing w:before="0" w:beforeAutospacing="0" w:after="0" w:afterAutospacing="0"/>
+        <w:textAlignment w:val="baseline"/>
+        <w:rPr>
+          <w:rFonts w:ascii="Arial" w:hAnsi="Arial" w:cs="Arial"/>
+          <w:color w:val="000000"/>
+        </w:rPr>
+      </w:pPr>
+      <w:r>
+        <w:rPr>
+          <w:rFonts w:ascii="Arial" w:hAnsi="Arial" w:cs="Arial"/>
+          <w:b/>
+          <w:bCs/>
+          <w:color w:val="000000"/>
+        </w:rPr>
+        <w:t>The CGS Ecosystem:</w:t>
+      </w:r>
+      <w:r>
+        <w:rPr>
+          <w:rFonts w:ascii="Arial" w:hAnsi="Arial" w:cs="Arial"/>
+          <w:color w:val="000000"/>
+        </w:rPr>
+        <w:t xml:space="preserve"> We are actively soliciting speakers from the Complexity Global School (CGS) alumni networks, organizers, and faculty; the Complexity Coffee network.</w:t>
+      </w:r>
+    </w:p>
+    <w:p>
+      <w:pPr>
+        <w:pStyle w:val="NormalWeb"/>
+        <w:numPr>
+          <w:ilvl w:val="0"/>
+          <w:numId w:val="101"/>
+        </w:numPr>
+        <w:spacing w:before="0" w:beforeAutospacing="0" w:after="0" w:afterAutospacing="0"/>
+        <w:textAlignment w:val="baseline"/>
+        <w:rPr>
+          <w:rFonts w:ascii="Arial" w:hAnsi="Arial" w:cs="Arial"/>
+          <w:color w:val="000000"/>
+        </w:rPr>
+      </w:pPr>
+      <w:r>
+        <w:rPr>
+          <w:rFonts w:ascii="Arial" w:hAnsi="Arial" w:cs="Arial"/>
+          <w:b/>
+          <w:bCs/>
+          <w:color w:val="000000"/>
+        </w:rPr>
+        <w:t>Wolfram Institute Fellows &amp; Wolfram Research Staff:</w:t>
+      </w:r>
+      <w:r>
+        <w:rPr>
+          <w:rFonts w:ascii="Arial" w:hAnsi="Arial" w:cs="Arial"/>
+          <w:color w:val="000000"/>
+        </w:rPr>
+        <w:t xml:space="preserve"> Computational scientists and developers applying symbolic programming to model complex and unconventional systems.</w:t>
+      </w:r>
+    </w:p>
+    <w:p>
+      <w:pPr>
+        <w:pStyle w:val="NormalWeb"/>
+        <w:numPr>
+          <w:ilvl w:val="0"/>
+          <w:numId w:val="101"/>
+        </w:numPr>
+        <w:spacing w:before="0" w:beforeAutospacing="0" w:after="240" w:afterAutospacing="0"/>
         <w:textAlignment w:val="baseline"/>
         <w:rPr>
           <w:rFonts w:ascii="Arial" w:hAnsi="Arial" w:cs="Arial"/>
@@ -1967,37 +1627,6 @@
           <w:color w:val="000000"/>
         </w:rPr>
         <w:t xml:space="preserve"> We have connected with the Women in Network Science group to distribute our call for speakers to ensure a diverse and inclusive lineup. </w:t>
-      </w:r>
-    </w:p>
-    <w:p>
-      <w:pPr>
-        <w:pStyle w:val="NormalWeb"/>
-        <w:numPr>
-          <w:ilvl w:val="0"/>
-          <w:numId w:val="101"/>
-        </w:numPr>
-        <w:spacing w:before="0" w:beforeAutospacing="0" w:after="240" w:afterAutospacing="0"/>
-        <w:textAlignment w:val="baseline"/>
-        <w:rPr>
-          <w:rFonts w:ascii="Arial" w:hAnsi="Arial" w:cs="Arial"/>
-          <w:color w:val="000000"/>
-        </w:rPr>
-      </w:pPr>
-      <w:r>
-        <w:rPr>
-          <w:rFonts w:ascii="Arial" w:hAnsi="Arial" w:cs="Arial"/>
-          <w:b/>
-          <w:bCs/>
-          <w:color w:val="000000"/>
-        </w:rPr>
-        <w:t>Wolfram Institute Fellows &amp; Wolfram Research Staff:</w:t>
-      </w:r>
-      <w:r>
-        <w:rPr>
-          <w:rFonts w:ascii="Arial" w:hAnsi="Arial" w:cs="Arial"/>
-          <w:color w:val="000000"/>
-        </w:rPr>
-        <w:t xml:space="preserve"> Computational scientists and developers applying symbolic programming to model complex and unconventional systems.</w:t>
       </w:r>
     </w:p>
     <w:p/>

</xml_diff>